<commit_message>
Mise à jour global (monétisation à 10% , mobile patient et inscription praticien)
</commit_message>
<xml_diff>
--- a/MODELE_ECONOMIQUE_ET_MONETISATION_EDOCTOR.docx
+++ b/MODELE_ECONOMIQUE_ET_MONETISATION_EDOCTOR.docx
@@ -41,7 +41,7 @@
           <w:color w:val="529927"/>
           <w:sz w:val="19"/>
         </w:rPr>
-        <w:t>💡 Synthèse Décisionnelle DG : Pour maximiser l'adhésion massive des hôpitaux et pharmacies au Togo, eDoctor applique une politique de ZÉRO PRÉLÈVEMENT sur les honoraires médicaux et sur les ventes de médicaments. Les hôpitaux fixent librement leurs tarifs et perçoivent 100% de leur prix. Les pharmacies perçoivent 100% du prix des produits. Le modèle économique d'eDoctor repose sur des frais de service plateforme fixes et transparents payés par le patient (600 FCFA par consultation incluant les frais Mobile Money, 150 FCFA par ordonnance trouvée en pharmacie de proximité), complétés par une tarification kilométrique juste de la livraison (500 FCFA pour les 2 premiers km + 150 FCFA/km sup).</w:t>
+        <w:t>💡 Synthèse Décisionnelle DG : Pour maximiser l'adhésion massive des hôpitaux et pharmacies au Togo, eDoctor applique une politique de ZÉRO PRÉLÈVEMENT sur les honoraires médicaux et sur les ventes de médicaments. Les hôpitaux fixent librement leurs tarifs et perçoivent 100% de leur prix. Les pharmacies perçoivent 100% du prix des produits. Le modèle économique d'eDoctor repose sur des frais de service plateforme proportionnels et équitables payés par le patient (10% du tarif de consultation de l'hôpital incluant les frais Mobile Money, 150 FCFA par ordonnance trouvée en pharmacie de proximité), complétés par une tarification kilométrique juste de la livraison (500 FCFA pour les 2 premiers km + 150 FCFA/km sup).</w:t>
       </w:r>
     </w:p>
     <w:p>
@@ -108,13 +108,13 @@
           <w:b/>
           <w:color w:val="1E293B"/>
         </w:rPr>
-        <w:t xml:space="preserve">Frais de service plateforme eDoctor (600 FCFA payés par le patient) : </w:t>
+        <w:t xml:space="preserve">Frais de service plateforme eDoctor (10% du tarif hôpital payés par le patient) : </w:t>
       </w:r>
       <w:r>
         <w:rPr>
           <w:color w:val="1E293B"/>
         </w:rPr>
-        <w:t>Lors du paiement, la plateforme ajoute un forfait fixe de 600 FCFA à la charge du patient. Ce montant couvre l'infrastructure technologique sécurisée, la visio-consultation chiffrée, l'archivage du dossier médical et intègre/absorbe l'intégralité des frais de passerelle financière Mobile Money (T-Money, Flooz).</w:t>
+        <w:t>Lors du paiement, la plateforme applique des frais proportionnels de 10% calculés directement sur le tarif de consultation fixé par l'établissement. Ce montant couvre l'infrastructure technologique sécurisée, la visio-consultation chiffrée, l'archivage du dossier médical et intègre/absorbe l'intégralité des frais de passerelle financière Mobile Money (T-Money, Flooz).</w:t>
       </w:r>
     </w:p>
     <w:p>
@@ -132,7 +132,7 @@
         <w:rPr>
           <w:color w:val="1E293B"/>
         </w:rPr>
-        <w:t>Si le CHU fixe la consultation à 3 000 FCFA, le patient règle 3 600 FCFA via son compte T-Money. L'hôpital perçoit exactement 3 000 FCFA (100%), eDoctor perçoit 600 FCFA de frais de service net.</w:t>
+        <w:t>Si le CHU fixe la consultation à 3 000 FCFA, les frais eDoctor sont de 10% soit 300 FCFA. Le patient règle au total 3 300 FCFA via son compte T-Money. L'hôpital perçoit exactement 3 000 FCFA (100%), et eDoctor perçoit 300 FCFA de frais de service net. Pour une consultation à 5 000 FCFA, eDoctor perçoit 500 FCFA (10%) et le patient règle 5 500 FCFA.</w:t>
       </w:r>
     </w:p>
     <w:p>
@@ -593,7 +593,7 @@
                 <w:rFonts w:ascii="Arial" w:hAnsi="Arial"/>
                 <w:sz w:val="17"/>
               </w:rPr>
-              <w:t>2 600 FCFA</w:t>
+              <w:t>2 200 FCFA</w:t>
             </w:r>
           </w:p>
         </w:tc>
@@ -667,7 +667,7 @@
                 <w:color w:val="529927"/>
                 <w:sz w:val="17"/>
               </w:rPr>
-              <w:t>600 FCFA (Frais fixe)</w:t>
+              <w:t>200 FCFA (10% tarif hôpital)</w:t>
             </w:r>
           </w:p>
         </w:tc>
@@ -692,7 +692,7 @@
                 <w:color w:val="132A45"/>
                 <w:sz w:val="17"/>
               </w:rPr>
-              <w:t>Téléconsultation Généraliste (3 500 F)</w:t>
+              <w:t>Téléconsultation Standard CHU (3 000 F)</w:t>
             </w:r>
           </w:p>
         </w:tc>
@@ -716,7 +716,7 @@
                 <w:rFonts w:ascii="Arial" w:hAnsi="Arial"/>
                 <w:sz w:val="17"/>
               </w:rPr>
-              <w:t>4 100 FCFA</w:t>
+              <w:t>3 300 FCFA</w:t>
             </w:r>
           </w:p>
         </w:tc>
@@ -740,7 +740,7 @@
                 <w:rFonts w:ascii="Arial" w:hAnsi="Arial"/>
                 <w:sz w:val="17"/>
               </w:rPr>
-              <w:t>3 500 FCFA (100%)</w:t>
+              <w:t>3 000 FCFA (100%)</w:t>
             </w:r>
           </w:p>
         </w:tc>
@@ -790,7 +790,7 @@
                 <w:color w:val="529927"/>
                 <w:sz w:val="17"/>
               </w:rPr>
-              <w:t>600 FCFA (Frais fixe)</w:t>
+              <w:t>300 FCFA (10% tarif hôpital)</w:t>
             </w:r>
           </w:p>
         </w:tc>
@@ -815,7 +815,7 @@
                 <w:color w:val="132A45"/>
                 <w:sz w:val="17"/>
               </w:rPr>
-              <w:t>Téléconsultation Spécialiste (7 000 F)</w:t>
+              <w:t>Téléconsultation Généraliste (3 500 F)</w:t>
             </w:r>
           </w:p>
         </w:tc>
@@ -839,7 +839,7 @@
                 <w:rFonts w:ascii="Arial" w:hAnsi="Arial"/>
                 <w:sz w:val="17"/>
               </w:rPr>
-              <w:t>7 600 FCFA</w:t>
+              <w:t>3 850 FCFA</w:t>
             </w:r>
           </w:p>
         </w:tc>
@@ -863,7 +863,7 @@
                 <w:rFonts w:ascii="Arial" w:hAnsi="Arial"/>
                 <w:sz w:val="17"/>
               </w:rPr>
-              <w:t>7 000 FCFA (100%)</w:t>
+              <w:t>3 500 FCFA (100%)</w:t>
             </w:r>
           </w:p>
         </w:tc>
@@ -913,7 +913,7 @@
                 <w:color w:val="529927"/>
                 <w:sz w:val="17"/>
               </w:rPr>
-              <w:t>600 FCFA (Frais fixe)</w:t>
+              <w:t>350 FCFA (10% tarif hôpital)</w:t>
             </w:r>
           </w:p>
         </w:tc>
@@ -938,7 +938,7 @@
                 <w:color w:val="132A45"/>
                 <w:sz w:val="17"/>
               </w:rPr>
-              <w:t>Commande Pharmacie (Retrait comptoir)</w:t>
+              <w:t>Téléconsultation Spécialiste (7 000 F)</w:t>
             </w:r>
           </w:p>
         </w:tc>
@@ -962,7 +962,7 @@
                 <w:rFonts w:ascii="Arial" w:hAnsi="Arial"/>
                 <w:sz w:val="17"/>
               </w:rPr>
-              <w:t>Prix Médicaments + 150 F</w:t>
+              <w:t>7 700 FCFA</w:t>
             </w:r>
           </w:p>
         </w:tc>
@@ -986,253 +986,7 @@
                 <w:rFonts w:ascii="Arial" w:hAnsi="Arial"/>
                 <w:sz w:val="17"/>
               </w:rPr>
-              <w:t>—</w:t>
-            </w:r>
-          </w:p>
-        </w:tc>
-        <w:tc>
-          <w:tcPr>
-            <w:tcW w:type="dxa" w:w="1987"/>
-            <w:shd w:fill="FFFFFF"/>
-            <w:tcMar>
-              <w:top w:w="90" w:type="dxa"/>
-              <w:bottom w:w="90" w:type="dxa"/>
-              <w:left w:w="80" w:type="dxa"/>
-              <w:right w:w="80" w:type="dxa"/>
-            </w:tcMar>
-          </w:tcPr>
-          <w:p>
-            <w:pPr>
-              <w:jc w:val="right"/>
-            </w:pPr>
-            <w:r>
-              <w:rPr>
-                <w:rFonts w:ascii="Arial" w:hAnsi="Arial"/>
-                <w:sz w:val="17"/>
-              </w:rPr>
-              <w:t>100% Prix Médicaments</w:t>
-            </w:r>
-          </w:p>
-        </w:tc>
-        <w:tc>
-          <w:tcPr>
-            <w:tcW w:type="dxa" w:w="1987"/>
-            <w:shd w:fill="FFFFFF"/>
-            <w:tcMar>
-              <w:top w:w="90" w:type="dxa"/>
-              <w:bottom w:w="90" w:type="dxa"/>
-              <w:left w:w="80" w:type="dxa"/>
-              <w:right w:w="80" w:type="dxa"/>
-            </w:tcMar>
-          </w:tcPr>
-          <w:p>
-            <w:pPr>
-              <w:jc w:val="right"/>
-            </w:pPr>
-            <w:r>
-              <w:rPr>
-                <w:rFonts w:ascii="Arial" w:hAnsi="Arial"/>
-                <w:b/>
-                <w:color w:val="529927"/>
-                <w:sz w:val="17"/>
-              </w:rPr>
-              <w:t>150 FCFA (Frais mise en rel.)</w:t>
-            </w:r>
-          </w:p>
-        </w:tc>
-      </w:tr>
-      <w:tr>
-        <w:tc>
-          <w:tcPr>
-            <w:tcW w:type="dxa" w:w="1987"/>
-            <w:shd w:fill="F8FAFC"/>
-            <w:tcMar>
-              <w:top w:w="90" w:type="dxa"/>
-              <w:bottom w:w="90" w:type="dxa"/>
-              <w:left w:w="80" w:type="dxa"/>
-              <w:right w:w="80" w:type="dxa"/>
-            </w:tcMar>
-          </w:tcPr>
-          <w:p>
-            <w:r>
-              <w:rPr>
-                <w:rFonts w:ascii="Arial" w:hAnsi="Arial"/>
-                <w:b/>
-                <w:color w:val="132A45"/>
-                <w:sz w:val="17"/>
-              </w:rPr>
-              <w:t>Commande Pharmacie + Livraison (4 km)</w:t>
-            </w:r>
-          </w:p>
-        </w:tc>
-        <w:tc>
-          <w:tcPr>
-            <w:tcW w:type="dxa" w:w="1987"/>
-            <w:shd w:fill="F8FAFC"/>
-            <w:tcMar>
-              <w:top w:w="90" w:type="dxa"/>
-              <w:bottom w:w="90" w:type="dxa"/>
-              <w:left w:w="80" w:type="dxa"/>
-              <w:right w:w="80" w:type="dxa"/>
-            </w:tcMar>
-          </w:tcPr>
-          <w:p>
-            <w:pPr>
-              <w:jc w:val="right"/>
-            </w:pPr>
-            <w:r>
-              <w:rPr>
-                <w:rFonts w:ascii="Arial" w:hAnsi="Arial"/>
-                <w:sz w:val="17"/>
-              </w:rPr>
-              <w:t>Prix Médoc + 150 F + 800 F</w:t>
-            </w:r>
-          </w:p>
-        </w:tc>
-        <w:tc>
-          <w:tcPr>
-            <w:tcW w:type="dxa" w:w="1987"/>
-            <w:shd w:fill="F8FAFC"/>
-            <w:tcMar>
-              <w:top w:w="90" w:type="dxa"/>
-              <w:bottom w:w="90" w:type="dxa"/>
-              <w:left w:w="80" w:type="dxa"/>
-              <w:right w:w="80" w:type="dxa"/>
-            </w:tcMar>
-          </w:tcPr>
-          <w:p>
-            <w:pPr>
-              <w:jc w:val="right"/>
-            </w:pPr>
-            <w:r>
-              <w:rPr>
-                <w:rFonts w:ascii="Arial" w:hAnsi="Arial"/>
-                <w:sz w:val="17"/>
-              </w:rPr>
-              <w:t>—</w:t>
-            </w:r>
-          </w:p>
-        </w:tc>
-        <w:tc>
-          <w:tcPr>
-            <w:tcW w:type="dxa" w:w="1987"/>
-            <w:shd w:fill="F8FAFC"/>
-            <w:tcMar>
-              <w:top w:w="90" w:type="dxa"/>
-              <w:bottom w:w="90" w:type="dxa"/>
-              <w:left w:w="80" w:type="dxa"/>
-              <w:right w:w="80" w:type="dxa"/>
-            </w:tcMar>
-          </w:tcPr>
-          <w:p>
-            <w:pPr>
-              <w:jc w:val="right"/>
-            </w:pPr>
-            <w:r>
-              <w:rPr>
-                <w:rFonts w:ascii="Arial" w:hAnsi="Arial"/>
-                <w:sz w:val="17"/>
-              </w:rPr>
-              <w:t>100% Médoc + 600 F Coursier</w:t>
-            </w:r>
-          </w:p>
-        </w:tc>
-        <w:tc>
-          <w:tcPr>
-            <w:tcW w:type="dxa" w:w="1987"/>
-            <w:shd w:fill="F8FAFC"/>
-            <w:tcMar>
-              <w:top w:w="90" w:type="dxa"/>
-              <w:bottom w:w="90" w:type="dxa"/>
-              <w:left w:w="80" w:type="dxa"/>
-              <w:right w:w="80" w:type="dxa"/>
-            </w:tcMar>
-          </w:tcPr>
-          <w:p>
-            <w:pPr>
-              <w:jc w:val="right"/>
-            </w:pPr>
-            <w:r>
-              <w:rPr>
-                <w:rFonts w:ascii="Arial" w:hAnsi="Arial"/>
-                <w:b/>
-                <w:color w:val="529927"/>
-                <w:sz w:val="17"/>
-              </w:rPr>
-              <w:t>350 FCFA (150F + 200F Marge livr.)</w:t>
-            </w:r>
-          </w:p>
-        </w:tc>
-      </w:tr>
-      <w:tr>
-        <w:tc>
-          <w:tcPr>
-            <w:tcW w:type="dxa" w:w="1987"/>
-            <w:shd w:fill="FFFFFF"/>
-            <w:tcMar>
-              <w:top w:w="90" w:type="dxa"/>
-              <w:bottom w:w="90" w:type="dxa"/>
-              <w:left w:w="80" w:type="dxa"/>
-              <w:right w:w="80" w:type="dxa"/>
-            </w:tcMar>
-          </w:tcPr>
-          <w:p>
-            <w:r>
-              <w:rPr>
-                <w:rFonts w:ascii="Arial" w:hAnsi="Arial"/>
-                <w:b/>
-                <w:color w:val="132A45"/>
-                <w:sz w:val="17"/>
-              </w:rPr>
-              <w:t>Soins Infirmiers à Domicile (5 000 F)</w:t>
-            </w:r>
-          </w:p>
-        </w:tc>
-        <w:tc>
-          <w:tcPr>
-            <w:tcW w:type="dxa" w:w="1987"/>
-            <w:shd w:fill="FFFFFF"/>
-            <w:tcMar>
-              <w:top w:w="90" w:type="dxa"/>
-              <w:bottom w:w="90" w:type="dxa"/>
-              <w:left w:w="80" w:type="dxa"/>
-              <w:right w:w="80" w:type="dxa"/>
-            </w:tcMar>
-          </w:tcPr>
-          <w:p>
-            <w:pPr>
-              <w:jc w:val="right"/>
-            </w:pPr>
-            <w:r>
-              <w:rPr>
-                <w:rFonts w:ascii="Arial" w:hAnsi="Arial"/>
-                <w:sz w:val="17"/>
-              </w:rPr>
-              <w:t>5 600 FCFA</w:t>
-            </w:r>
-          </w:p>
-        </w:tc>
-        <w:tc>
-          <w:tcPr>
-            <w:tcW w:type="dxa" w:w="1987"/>
-            <w:shd w:fill="FFFFFF"/>
-            <w:tcMar>
-              <w:top w:w="90" w:type="dxa"/>
-              <w:bottom w:w="90" w:type="dxa"/>
-              <w:left w:w="80" w:type="dxa"/>
-              <w:right w:w="80" w:type="dxa"/>
-            </w:tcMar>
-          </w:tcPr>
-          <w:p>
-            <w:pPr>
-              <w:jc w:val="right"/>
-            </w:pPr>
-            <w:r>
-              <w:rPr>
-                <w:rFonts w:ascii="Arial" w:hAnsi="Arial"/>
-                <w:sz w:val="17"/>
-              </w:rPr>
-              <w:t>5 000 FCFA (100% Hôpital)</w:t>
+              <w:t>7 000 FCFA (100%)</w:t>
             </w:r>
           </w:p>
         </w:tc>
@@ -1282,7 +1036,376 @@
                 <w:color w:val="529927"/>
                 <w:sz w:val="17"/>
               </w:rPr>
-              <w:t>600 FCFA (Frais fixe)</w:t>
+              <w:t>700 FCFA (10% tarif hôpital)</w:t>
+            </w:r>
+          </w:p>
+        </w:tc>
+      </w:tr>
+      <w:tr>
+        <w:tc>
+          <w:tcPr>
+            <w:tcW w:type="dxa" w:w="1987"/>
+            <w:shd w:fill="F8FAFC"/>
+            <w:tcMar>
+              <w:top w:w="90" w:type="dxa"/>
+              <w:bottom w:w="90" w:type="dxa"/>
+              <w:left w:w="80" w:type="dxa"/>
+              <w:right w:w="80" w:type="dxa"/>
+            </w:tcMar>
+          </w:tcPr>
+          <w:p>
+            <w:r>
+              <w:rPr>
+                <w:rFonts w:ascii="Arial" w:hAnsi="Arial"/>
+                <w:b/>
+                <w:color w:val="132A45"/>
+                <w:sz w:val="17"/>
+              </w:rPr>
+              <w:t>Commande Pharmacie (Retrait comptoir)</w:t>
+            </w:r>
+          </w:p>
+        </w:tc>
+        <w:tc>
+          <w:tcPr>
+            <w:tcW w:type="dxa" w:w="1987"/>
+            <w:shd w:fill="F8FAFC"/>
+            <w:tcMar>
+              <w:top w:w="90" w:type="dxa"/>
+              <w:bottom w:w="90" w:type="dxa"/>
+              <w:left w:w="80" w:type="dxa"/>
+              <w:right w:w="80" w:type="dxa"/>
+            </w:tcMar>
+          </w:tcPr>
+          <w:p>
+            <w:pPr>
+              <w:jc w:val="right"/>
+            </w:pPr>
+            <w:r>
+              <w:rPr>
+                <w:rFonts w:ascii="Arial" w:hAnsi="Arial"/>
+                <w:sz w:val="17"/>
+              </w:rPr>
+              <w:t>Prix Médicaments + 150 F</w:t>
+            </w:r>
+          </w:p>
+        </w:tc>
+        <w:tc>
+          <w:tcPr>
+            <w:tcW w:type="dxa" w:w="1987"/>
+            <w:shd w:fill="F8FAFC"/>
+            <w:tcMar>
+              <w:top w:w="90" w:type="dxa"/>
+              <w:bottom w:w="90" w:type="dxa"/>
+              <w:left w:w="80" w:type="dxa"/>
+              <w:right w:w="80" w:type="dxa"/>
+            </w:tcMar>
+          </w:tcPr>
+          <w:p>
+            <w:pPr>
+              <w:jc w:val="right"/>
+            </w:pPr>
+            <w:r>
+              <w:rPr>
+                <w:rFonts w:ascii="Arial" w:hAnsi="Arial"/>
+                <w:sz w:val="17"/>
+              </w:rPr>
+              <w:t>—</w:t>
+            </w:r>
+          </w:p>
+        </w:tc>
+        <w:tc>
+          <w:tcPr>
+            <w:tcW w:type="dxa" w:w="1987"/>
+            <w:shd w:fill="F8FAFC"/>
+            <w:tcMar>
+              <w:top w:w="90" w:type="dxa"/>
+              <w:bottom w:w="90" w:type="dxa"/>
+              <w:left w:w="80" w:type="dxa"/>
+              <w:right w:w="80" w:type="dxa"/>
+            </w:tcMar>
+          </w:tcPr>
+          <w:p>
+            <w:pPr>
+              <w:jc w:val="right"/>
+            </w:pPr>
+            <w:r>
+              <w:rPr>
+                <w:rFonts w:ascii="Arial" w:hAnsi="Arial"/>
+                <w:sz w:val="17"/>
+              </w:rPr>
+              <w:t>100% Prix Médicaments</w:t>
+            </w:r>
+          </w:p>
+        </w:tc>
+        <w:tc>
+          <w:tcPr>
+            <w:tcW w:type="dxa" w:w="1987"/>
+            <w:shd w:fill="F8FAFC"/>
+            <w:tcMar>
+              <w:top w:w="90" w:type="dxa"/>
+              <w:bottom w:w="90" w:type="dxa"/>
+              <w:left w:w="80" w:type="dxa"/>
+              <w:right w:w="80" w:type="dxa"/>
+            </w:tcMar>
+          </w:tcPr>
+          <w:p>
+            <w:pPr>
+              <w:jc w:val="right"/>
+            </w:pPr>
+            <w:r>
+              <w:rPr>
+                <w:rFonts w:ascii="Arial" w:hAnsi="Arial"/>
+                <w:b/>
+                <w:color w:val="529927"/>
+                <w:sz w:val="17"/>
+              </w:rPr>
+              <w:t>150 FCFA (Frais mise en rel.)</w:t>
+            </w:r>
+          </w:p>
+        </w:tc>
+      </w:tr>
+      <w:tr>
+        <w:tc>
+          <w:tcPr>
+            <w:tcW w:type="dxa" w:w="1987"/>
+            <w:shd w:fill="FFFFFF"/>
+            <w:tcMar>
+              <w:top w:w="90" w:type="dxa"/>
+              <w:bottom w:w="90" w:type="dxa"/>
+              <w:left w:w="80" w:type="dxa"/>
+              <w:right w:w="80" w:type="dxa"/>
+            </w:tcMar>
+          </w:tcPr>
+          <w:p>
+            <w:r>
+              <w:rPr>
+                <w:rFonts w:ascii="Arial" w:hAnsi="Arial"/>
+                <w:b/>
+                <w:color w:val="132A45"/>
+                <w:sz w:val="17"/>
+              </w:rPr>
+              <w:t>Commande Pharmacie + Livraison (4 km)</w:t>
+            </w:r>
+          </w:p>
+        </w:tc>
+        <w:tc>
+          <w:tcPr>
+            <w:tcW w:type="dxa" w:w="1987"/>
+            <w:shd w:fill="FFFFFF"/>
+            <w:tcMar>
+              <w:top w:w="90" w:type="dxa"/>
+              <w:bottom w:w="90" w:type="dxa"/>
+              <w:left w:w="80" w:type="dxa"/>
+              <w:right w:w="80" w:type="dxa"/>
+            </w:tcMar>
+          </w:tcPr>
+          <w:p>
+            <w:pPr>
+              <w:jc w:val="right"/>
+            </w:pPr>
+            <w:r>
+              <w:rPr>
+                <w:rFonts w:ascii="Arial" w:hAnsi="Arial"/>
+                <w:sz w:val="17"/>
+              </w:rPr>
+              <w:t>Prix Médoc + 150 F + 800 F</w:t>
+            </w:r>
+          </w:p>
+        </w:tc>
+        <w:tc>
+          <w:tcPr>
+            <w:tcW w:type="dxa" w:w="1987"/>
+            <w:shd w:fill="FFFFFF"/>
+            <w:tcMar>
+              <w:top w:w="90" w:type="dxa"/>
+              <w:bottom w:w="90" w:type="dxa"/>
+              <w:left w:w="80" w:type="dxa"/>
+              <w:right w:w="80" w:type="dxa"/>
+            </w:tcMar>
+          </w:tcPr>
+          <w:p>
+            <w:pPr>
+              <w:jc w:val="right"/>
+            </w:pPr>
+            <w:r>
+              <w:rPr>
+                <w:rFonts w:ascii="Arial" w:hAnsi="Arial"/>
+                <w:sz w:val="17"/>
+              </w:rPr>
+              <w:t>—</w:t>
+            </w:r>
+          </w:p>
+        </w:tc>
+        <w:tc>
+          <w:tcPr>
+            <w:tcW w:type="dxa" w:w="1987"/>
+            <w:shd w:fill="FFFFFF"/>
+            <w:tcMar>
+              <w:top w:w="90" w:type="dxa"/>
+              <w:bottom w:w="90" w:type="dxa"/>
+              <w:left w:w="80" w:type="dxa"/>
+              <w:right w:w="80" w:type="dxa"/>
+            </w:tcMar>
+          </w:tcPr>
+          <w:p>
+            <w:pPr>
+              <w:jc w:val="right"/>
+            </w:pPr>
+            <w:r>
+              <w:rPr>
+                <w:rFonts w:ascii="Arial" w:hAnsi="Arial"/>
+                <w:sz w:val="17"/>
+              </w:rPr>
+              <w:t>100% Médoc + 600 F Coursier</w:t>
+            </w:r>
+          </w:p>
+        </w:tc>
+        <w:tc>
+          <w:tcPr>
+            <w:tcW w:type="dxa" w:w="1987"/>
+            <w:shd w:fill="FFFFFF"/>
+            <w:tcMar>
+              <w:top w:w="90" w:type="dxa"/>
+              <w:bottom w:w="90" w:type="dxa"/>
+              <w:left w:w="80" w:type="dxa"/>
+              <w:right w:w="80" w:type="dxa"/>
+            </w:tcMar>
+          </w:tcPr>
+          <w:p>
+            <w:pPr>
+              <w:jc w:val="right"/>
+            </w:pPr>
+            <w:r>
+              <w:rPr>
+                <w:rFonts w:ascii="Arial" w:hAnsi="Arial"/>
+                <w:b/>
+                <w:color w:val="529927"/>
+                <w:sz w:val="17"/>
+              </w:rPr>
+              <w:t>350 FCFA (150F + 200F Marge livr.)</w:t>
+            </w:r>
+          </w:p>
+        </w:tc>
+      </w:tr>
+      <w:tr>
+        <w:tc>
+          <w:tcPr>
+            <w:tcW w:type="dxa" w:w="1987"/>
+            <w:shd w:fill="F8FAFC"/>
+            <w:tcMar>
+              <w:top w:w="90" w:type="dxa"/>
+              <w:bottom w:w="90" w:type="dxa"/>
+              <w:left w:w="80" w:type="dxa"/>
+              <w:right w:w="80" w:type="dxa"/>
+            </w:tcMar>
+          </w:tcPr>
+          <w:p>
+            <w:r>
+              <w:rPr>
+                <w:rFonts w:ascii="Arial" w:hAnsi="Arial"/>
+                <w:b/>
+                <w:color w:val="132A45"/>
+                <w:sz w:val="17"/>
+              </w:rPr>
+              <w:t>Soins Infirmiers à Domicile (5 000 F)</w:t>
+            </w:r>
+          </w:p>
+        </w:tc>
+        <w:tc>
+          <w:tcPr>
+            <w:tcW w:type="dxa" w:w="1987"/>
+            <w:shd w:fill="F8FAFC"/>
+            <w:tcMar>
+              <w:top w:w="90" w:type="dxa"/>
+              <w:bottom w:w="90" w:type="dxa"/>
+              <w:left w:w="80" w:type="dxa"/>
+              <w:right w:w="80" w:type="dxa"/>
+            </w:tcMar>
+          </w:tcPr>
+          <w:p>
+            <w:pPr>
+              <w:jc w:val="right"/>
+            </w:pPr>
+            <w:r>
+              <w:rPr>
+                <w:rFonts w:ascii="Arial" w:hAnsi="Arial"/>
+                <w:sz w:val="17"/>
+              </w:rPr>
+              <w:t>5 500 FCFA</w:t>
+            </w:r>
+          </w:p>
+        </w:tc>
+        <w:tc>
+          <w:tcPr>
+            <w:tcW w:type="dxa" w:w="1987"/>
+            <w:shd w:fill="F8FAFC"/>
+            <w:tcMar>
+              <w:top w:w="90" w:type="dxa"/>
+              <w:bottom w:w="90" w:type="dxa"/>
+              <w:left w:w="80" w:type="dxa"/>
+              <w:right w:w="80" w:type="dxa"/>
+            </w:tcMar>
+          </w:tcPr>
+          <w:p>
+            <w:pPr>
+              <w:jc w:val="right"/>
+            </w:pPr>
+            <w:r>
+              <w:rPr>
+                <w:rFonts w:ascii="Arial" w:hAnsi="Arial"/>
+                <w:sz w:val="17"/>
+              </w:rPr>
+              <w:t>5 000 FCFA (100% Hôpital)</w:t>
+            </w:r>
+          </w:p>
+        </w:tc>
+        <w:tc>
+          <w:tcPr>
+            <w:tcW w:type="dxa" w:w="1987"/>
+            <w:shd w:fill="F8FAFC"/>
+            <w:tcMar>
+              <w:top w:w="90" w:type="dxa"/>
+              <w:bottom w:w="90" w:type="dxa"/>
+              <w:left w:w="80" w:type="dxa"/>
+              <w:right w:w="80" w:type="dxa"/>
+            </w:tcMar>
+          </w:tcPr>
+          <w:p>
+            <w:pPr>
+              <w:jc w:val="right"/>
+            </w:pPr>
+            <w:r>
+              <w:rPr>
+                <w:rFonts w:ascii="Arial" w:hAnsi="Arial"/>
+                <w:sz w:val="17"/>
+              </w:rPr>
+              <w:t>—</w:t>
+            </w:r>
+          </w:p>
+        </w:tc>
+        <w:tc>
+          <w:tcPr>
+            <w:tcW w:type="dxa" w:w="1987"/>
+            <w:shd w:fill="F8FAFC"/>
+            <w:tcMar>
+              <w:top w:w="90" w:type="dxa"/>
+              <w:bottom w:w="90" w:type="dxa"/>
+              <w:left w:w="80" w:type="dxa"/>
+              <w:right w:w="80" w:type="dxa"/>
+            </w:tcMar>
+          </w:tcPr>
+          <w:p>
+            <w:pPr>
+              <w:jc w:val="right"/>
+            </w:pPr>
+            <w:r>
+              <w:rPr>
+                <w:rFonts w:ascii="Arial" w:hAnsi="Arial"/>
+                <w:b/>
+                <w:color w:val="529927"/>
+                <w:sz w:val="17"/>
+              </w:rPr>
+              <w:t>500 FCFA (10% tarif soin)</w:t>
             </w:r>
           </w:p>
         </w:tc>
@@ -1311,14 +1434,14 @@
           <w:b/>
           <w:color w:val="132A45"/>
         </w:rPr>
-        <w:t xml:space="preserve">Téléconsultations (2 000 actes/mois à 600 FCFA de frais eDoctor) : </w:t>
+        <w:t xml:space="preserve">Téléconsultations (2 000 actes/mois avec panier moyen 3 500 F et 10% eDoctor soit 350 FCFA) : </w:t>
       </w:r>
       <w:r>
         <w:rPr>
           <w:b w:val="0"/>
           <w:color w:val="1E293B"/>
         </w:rPr>
-        <w:t>Revenu eDoctor = 1 200 000 FCFA / mois.</w:t>
+        <w:t>Revenu eDoctor = 700 000 FCFA / mois.</w:t>
       </w:r>
     </w:p>
     <w:p>
@@ -1368,14 +1491,14 @@
           <w:b/>
           <w:color w:val="132A45"/>
         </w:rPr>
-        <w:t xml:space="preserve">Soins Infirmiers à Domicile (400 actes/mois à 600 FCFA de frais eDoctor) : </w:t>
+        <w:t xml:space="preserve">Soins Infirmiers à Domicile (400 actes/mois à 10% soit 500 FCFA de frais eDoctor) : </w:t>
       </w:r>
       <w:r>
         <w:rPr>
           <w:b w:val="0"/>
           <w:color w:val="1E293B"/>
         </w:rPr>
-        <w:t>Revenu eDoctor = 240 000 FCFA / mois.</w:t>
+        <w:t>Revenu eDoctor = 200 000 FCFA / mois.</w:t>
       </w:r>
     </w:p>
     <w:p>
@@ -1394,7 +1517,7 @@
           <w:b/>
           <w:color w:val="529927"/>
         </w:rPr>
-        <w:t>≈ 2 265 000 FCFA / mois (soit plus de 27 Millions FCFA / an dès le cap des 3 000 usagers réguliers).</w:t>
+        <w:t>≈ 1 725 000 FCFA / mois (soit plus de 20,7 Millions FCFA / an dès le cap des 3 000 usagers réguliers).</w:t>
       </w:r>
     </w:p>
     <w:p>
@@ -1419,7 +1542,7 @@
         <w:br/>
         <w:t>2. Séquestre Garanti (Escrow) : Les fonds sont immobilisés sur le compte régulé de la plateforme jusqu'à la fin effective de la consultation ou la remise des médicaments.</w:t>
         <w:br/>
-        <w:t>3. Découpage Automatique (Split) : Dès validation médicale, l'API crédite instantanément 100% de la part hôpital dans son solde virtuel partenaire, et alloue les 600 FCFA ou 150 FCFA dans le compte eDoctor.</w:t>
+        <w:t>3. Découpage Automatique (Split) : Dès validation médicale, l'API crédite instantanément 100% de la part hôpital dans son solde virtuel partenaire, et alloue la commission de 10% ou 150 FCFA dans le compte eDoctor.</w:t>
         <w:br/>
         <w:t>4. Reversement Autonome (Payout) : Les hôpitaux et officines peuvent demander un virement bancaire ou un transfert Mobile Money Marchand selon la périodicité souhaitée (quotidienne, hebdomadaire ou mensuelle).</w:t>
       </w:r>

</xml_diff>